<commit_message>
Update VIT M.Tech Project Report references section to IEEE citation format
</commit_message>
<xml_diff>
--- a/ATGC_MACIDS_Elaborate_Project_Report.docx
+++ b/ATGC_MACIDS_Elaborate_Project_Report.docx
@@ -9670,417 +9670,417 @@
     <w:p>
       <w:pPr>
         <w:spacing w:line="276" w:lineRule="auto" w:after="120"/>
-        <w:ind w:left="720" w:hanging="720"/>
-      </w:pPr>
-      <w:r>
-        <w:rPr>
-          <w:rFonts w:ascii="Times New Roman" w:hAnsi="Times New Roman"/>
-          <w:sz w:val="24"/>
-        </w:rPr>
-        <w:t>Al-Sawwa, J., Hassan, M., &amp; Rahman, A. (2024). Consensus-driven distributed intrusion detection systems for enterprise networks. Journal of Network and Computer Applications, 221, 103789.</w:t>
+        <w:ind w:left="576" w:hanging="576"/>
+      </w:pPr>
+      <w:r>
+        <w:rPr>
+          <w:rFonts w:ascii="Times New Roman" w:hAnsi="Times New Roman"/>
+          <w:sz w:val="22"/>
+        </w:rPr>
+        <w:t>[1] J. Al-Sawwa, M. Hassan, and A. Rahman, "Consensus-driven distributed intrusion detection systems for enterprise networks," Journal of Network and Computer Applications, vol. 221, p. 103789, 2024.</w:t>
       </w:r>
     </w:p>
     <w:p>
       <w:pPr>
         <w:spacing w:line="276" w:lineRule="auto" w:after="120"/>
-        <w:ind w:left="720" w:hanging="720"/>
-      </w:pPr>
-      <w:r>
-        <w:rPr>
-          <w:rFonts w:ascii="Times New Roman" w:hAnsi="Times New Roman"/>
-          <w:sz w:val="24"/>
-        </w:rPr>
-        <w:t>Breiman, L. (2001). Random forests. Machine Learning, 45(1), 5-32.</w:t>
+        <w:ind w:left="576" w:hanging="576"/>
+      </w:pPr>
+      <w:r>
+        <w:rPr>
+          <w:rFonts w:ascii="Times New Roman" w:hAnsi="Times New Roman"/>
+          <w:sz w:val="22"/>
+        </w:rPr>
+        <w:t>[2] L. Breiman, "Random forests," Machine Learning, vol. 45, no. 1, pp. 5–32, 2001.</w:t>
       </w:r>
     </w:p>
     <w:p>
       <w:pPr>
         <w:spacing w:line="276" w:lineRule="auto" w:after="120"/>
-        <w:ind w:left="720" w:hanging="720"/>
-      </w:pPr>
-      <w:r>
-        <w:rPr>
-          <w:rFonts w:ascii="Times New Roman" w:hAnsi="Times New Roman"/>
-          <w:sz w:val="24"/>
-        </w:rPr>
-        <w:t>Chen, L., Wang, Y., &amp; Zhang, X. (2020). DeepIDS: Deep learning for flow-based network intrusion detection. Computers &amp; Security, 97, 101957.</w:t>
+        <w:ind w:left="576" w:hanging="576"/>
+      </w:pPr>
+      <w:r>
+        <w:rPr>
+          <w:rFonts w:ascii="Times New Roman" w:hAnsi="Times New Roman"/>
+          <w:sz w:val="22"/>
+        </w:rPr>
+        <w:t>[3] L. Chen, Y. Wang, and X. Zhang, "DeepIDS: Deep learning for flow-based network intrusion detection," Computers &amp; Security, vol. 97, p. 101957, 2020.</w:t>
       </w:r>
     </w:p>
     <w:p>
       <w:pPr>
         <w:spacing w:line="276" w:lineRule="auto" w:after="120"/>
-        <w:ind w:left="720" w:hanging="720"/>
-      </w:pPr>
-      <w:r>
-        <w:rPr>
-          <w:rFonts w:ascii="Times New Roman" w:hAnsi="Times New Roman"/>
-          <w:sz w:val="24"/>
-        </w:rPr>
-        <w:t>Das, S., Patel, R., &amp; Verma, K. (2024). Dynamic node trust evaluation in vehicular ad-hoc networks. IEEE Transactions on Intelligent Transportation Systems, 25(4), 3210-3223.</w:t>
+        <w:ind w:left="576" w:hanging="576"/>
+      </w:pPr>
+      <w:r>
+        <w:rPr>
+          <w:rFonts w:ascii="Times New Roman" w:hAnsi="Times New Roman"/>
+          <w:sz w:val="22"/>
+        </w:rPr>
+        <w:t>[4] S. Das, R. Patel, and K. Verma, "Dynamic node trust evaluation in vehicular ad-hoc networks," IEEE Transactions on Intelligent Transportation Systems, vol. 25, no. 4, pp. 3210–3223, 2024.</w:t>
       </w:r>
     </w:p>
     <w:p>
       <w:pPr>
         <w:spacing w:line="276" w:lineRule="auto" w:after="120"/>
-        <w:ind w:left="720" w:hanging="720"/>
-      </w:pPr>
-      <w:r>
-        <w:rPr>
-          <w:rFonts w:ascii="Times New Roman" w:hAnsi="Times New Roman"/>
-          <w:sz w:val="24"/>
-        </w:rPr>
-        <w:t>Denning, D. E. (1987). An intrusion-detection model. IEEE Transactions on Software Engineering, (2), 222-232.</w:t>
+        <w:ind w:left="576" w:hanging="576"/>
+      </w:pPr>
+      <w:r>
+        <w:rPr>
+          <w:rFonts w:ascii="Times New Roman" w:hAnsi="Times New Roman"/>
+          <w:sz w:val="22"/>
+        </w:rPr>
+        <w:t>[5] D. E. Denning, "An intrusion-detection model," IEEE Transactions on Software Engineering, no. 2, pp. 222–232, 1987.</w:t>
       </w:r>
     </w:p>
     <w:p>
       <w:pPr>
         <w:spacing w:line="276" w:lineRule="auto" w:after="120"/>
-        <w:ind w:left="720" w:hanging="720"/>
-      </w:pPr>
-      <w:r>
-        <w:rPr>
-          <w:rFonts w:ascii="Times New Roman" w:hAnsi="Times New Roman"/>
-          <w:sz w:val="24"/>
-        </w:rPr>
-        <w:t>Eckart, C. (1951). Surface waves on water of variable depth. Wave Report 100, Scripps Institution of Oceanography, University of California, 99.</w:t>
+        <w:ind w:left="576" w:hanging="576"/>
+      </w:pPr>
+      <w:r>
+        <w:rPr>
+          <w:rFonts w:ascii="Times New Roman" w:hAnsi="Times New Roman"/>
+          <w:sz w:val="22"/>
+        </w:rPr>
+        <w:t>[6] C. Eckart, "Surface waves on water of variable depth," Wave Report 100, Scripps Institution of Oceanography, University of California, p. 99, 1951.</w:t>
       </w:r>
     </w:p>
     <w:p>
       <w:pPr>
         <w:spacing w:line="276" w:lineRule="auto" w:after="120"/>
-        <w:ind w:left="720" w:hanging="720"/>
-      </w:pPr>
-      <w:r>
-        <w:rPr>
-          <w:rFonts w:ascii="Times New Roman" w:hAnsi="Times New Roman"/>
-          <w:sz w:val="24"/>
-        </w:rPr>
-        <w:t>Ferguson, E., Davis, M., &amp; Miller, P. (2025). Real-time zero-day intrusion detection in edge networks. IEEE Transactions on Edge Computing, 6(1), 88-101.</w:t>
+        <w:ind w:left="576" w:hanging="576"/>
+      </w:pPr>
+      <w:r>
+        <w:rPr>
+          <w:rFonts w:ascii="Times New Roman" w:hAnsi="Times New Roman"/>
+          <w:sz w:val="22"/>
+        </w:rPr>
+        <w:t>[7] E. Ferguson, M. Davis, and P. Miller, "Real-time zero-day intrusion detection in edge networks," IEEE Transactions on Edge Computing, vol. 6, no. 1, pp. 88–101, 2025.</w:t>
       </w:r>
     </w:p>
     <w:p>
       <w:pPr>
         <w:spacing w:line="276" w:lineRule="auto" w:after="120"/>
-        <w:ind w:left="720" w:hanging="720"/>
-      </w:pPr>
-      <w:r>
-        <w:rPr>
-          <w:rFonts w:ascii="Times New Roman" w:hAnsi="Times New Roman"/>
-          <w:sz w:val="24"/>
-        </w:rPr>
-        <w:t>Gupta, V., Sharma, S., &amp; Kumar, P. (2025). Decentralized trust models in autonomous multi-agent networks. IEEE Transactions on Mobile Computing, 24(2), 789-802.</w:t>
+        <w:ind w:left="576" w:hanging="576"/>
+      </w:pPr>
+      <w:r>
+        <w:rPr>
+          <w:rFonts w:ascii="Times New Roman" w:hAnsi="Times New Roman"/>
+          <w:sz w:val="22"/>
+        </w:rPr>
+        <w:t>[8] V. Gupta, S. Sharma, and P. Kumar, "Decentralized trust models in autonomous multi-agent networks," IEEE Transactions on Mobile Computing, vol. 24, no. 2, pp. 789–802, 2025.</w:t>
       </w:r>
     </w:p>
     <w:p>
       <w:pPr>
         <w:spacing w:line="276" w:lineRule="auto" w:after="120"/>
-        <w:ind w:left="720" w:hanging="720"/>
-      </w:pPr>
-      <w:r>
-        <w:rPr>
-          <w:rFonts w:ascii="Times New Roman" w:hAnsi="Times New Roman"/>
-          <w:sz w:val="24"/>
-        </w:rPr>
-        <w:t>Hamilton, W., Ying, Z., &amp; Leskovec, J. (2017). Inductive representation learning on large graphs. Advances in Neural Information Processing Systems, 30, 1024-1034.</w:t>
+        <w:ind w:left="576" w:hanging="576"/>
+      </w:pPr>
+      <w:r>
+        <w:rPr>
+          <w:rFonts w:ascii="Times New Roman" w:hAnsi="Times New Roman"/>
+          <w:sz w:val="22"/>
+        </w:rPr>
+        <w:t>[9] W. Hamilton, Z. Ying, and J. Leskovec, "Inductive representation learning on large graphs," in Advances in Neural Information Processing Systems (NeurIPS), vol. 30, pp. 1024–1034, 2017.</w:t>
       </w:r>
     </w:p>
     <w:p>
       <w:pPr>
         <w:spacing w:line="276" w:lineRule="auto" w:after="120"/>
-        <w:ind w:left="720" w:hanging="720"/>
-      </w:pPr>
-      <w:r>
-        <w:rPr>
-          <w:rFonts w:ascii="Times New Roman" w:hAnsi="Times New Roman"/>
-          <w:sz w:val="24"/>
-        </w:rPr>
-        <w:t>Hassan, M., Ali, A., &amp; Ibrahim, K. (2024). Explainable graph neural networks for cyber threat intelligence. IEEE Security &amp; Privacy, 22(1), 45-56.</w:t>
+        <w:ind w:left="576" w:hanging="576"/>
+      </w:pPr>
+      <w:r>
+        <w:rPr>
+          <w:rFonts w:ascii="Times New Roman" w:hAnsi="Times New Roman"/>
+          <w:sz w:val="22"/>
+        </w:rPr>
+        <w:t>[10] M. Hassan, A. Ali, and K. Ibrahim, "Explainable graph neural networks for cyber threat intelligence," IEEE Security &amp; Privacy, vol. 22, no. 1, pp. 45–56, 2024.</w:t>
       </w:r>
     </w:p>
     <w:p>
       <w:pPr>
         <w:spacing w:line="276" w:lineRule="auto" w:after="120"/>
-        <w:ind w:left="720" w:hanging="720"/>
-      </w:pPr>
-      <w:r>
-        <w:rPr>
-          <w:rFonts w:ascii="Times New Roman" w:hAnsi="Times New Roman"/>
-          <w:sz w:val="24"/>
-        </w:rPr>
-        <w:t>Hasselmann, K., Munk, W. H., &amp; MacDonald, G. J. F. (1963). Bispectra of ocean waves. Time Series Analysis, John Wiley &amp; Sons, 125-139.</w:t>
+        <w:ind w:left="576" w:hanging="576"/>
+      </w:pPr>
+      <w:r>
+        <w:rPr>
+          <w:rFonts w:ascii="Times New Roman" w:hAnsi="Times New Roman"/>
+          <w:sz w:val="22"/>
+        </w:rPr>
+        <w:t>[11] K. Hasselmann, W. H. Munk, and G. J. F. MacDonald, "Bispectra of ocean waves," in Time Series Analysis, M. Rosenblatt, Ed., New York: John Wiley &amp; Sons, pp. 125–139, 1963.</w:t>
       </w:r>
     </w:p>
     <w:p>
       <w:pPr>
         <w:spacing w:line="276" w:lineRule="auto" w:after="120"/>
-        <w:ind w:left="720" w:hanging="720"/>
-      </w:pPr>
-      <w:r>
-        <w:rPr>
-          <w:rFonts w:ascii="Times New Roman" w:hAnsi="Times New Roman"/>
-          <w:sz w:val="24"/>
-        </w:rPr>
-        <w:t>Kim, D., Park, S., &amp; Lee, J. (2023). Automated containment planning using multi-agent reinforcement learning. IEEE Transactions on Network and Service Management, 20(2), 1542-1555.</w:t>
+        <w:ind w:left="576" w:hanging="576"/>
+      </w:pPr>
+      <w:r>
+        <w:rPr>
+          <w:rFonts w:ascii="Times New Roman" w:hAnsi="Times New Roman"/>
+          <w:sz w:val="22"/>
+        </w:rPr>
+        <w:t>[12] D. Kim, S. Park, and J. Lee, "Automated containment planning using multi-agent reinforcement learning," IEEE Transactions on Network and Service Management, vol. 20, no. 2, pp. 1542–1555, 2023.</w:t>
       </w:r>
     </w:p>
     <w:p>
       <w:pPr>
         <w:spacing w:line="276" w:lineRule="auto" w:after="120"/>
-        <w:ind w:left="720" w:hanging="720"/>
-      </w:pPr>
-      <w:r>
-        <w:rPr>
-          <w:rFonts w:ascii="Times New Roman" w:hAnsi="Times New Roman"/>
-          <w:sz w:val="24"/>
-        </w:rPr>
-        <w:t>Kipf, T. N., &amp; Welling, M. (2017). Semi-supervised classification with graph convolutional networks. International Conference on Learning Representations (ICLR).</w:t>
+        <w:ind w:left="576" w:hanging="576"/>
+      </w:pPr>
+      <w:r>
+        <w:rPr>
+          <w:rFonts w:ascii="Times New Roman" w:hAnsi="Times New Roman"/>
+          <w:sz w:val="22"/>
+        </w:rPr>
+        <w:t>[13] T. N. Kipf and M. Welling, "Semi-supervised classification with graph convolutional networks," in Proc. Int. Conf. Learn. Represent. (ICLR), 2017.</w:t>
       </w:r>
     </w:p>
     <w:p>
       <w:pPr>
         <w:spacing w:line="276" w:lineRule="auto" w:after="120"/>
-        <w:ind w:left="720" w:hanging="720"/>
-      </w:pPr>
-      <w:r>
-        <w:rPr>
-          <w:rFonts w:ascii="Times New Roman" w:hAnsi="Times New Roman"/>
-          <w:sz w:val="24"/>
-        </w:rPr>
-        <w:t>Kumar, R., Singh, A., &amp; Ray, S. (2024). Multi-agent reinforcement learning for autonomous network defense. IEEE/ACM Transactions on Networking, 32(1), 412-425.</w:t>
+        <w:ind w:left="576" w:hanging="576"/>
+      </w:pPr>
+      <w:r>
+        <w:rPr>
+          <w:rFonts w:ascii="Times New Roman" w:hAnsi="Times New Roman"/>
+          <w:sz w:val="22"/>
+        </w:rPr>
+        <w:t>[14] R. Kumar, A. Singh, and S. Ray, "Multi-agent reinforcement learning for autonomous network defense," IEEE/ACM Transactions on Networking, vol. 32, no. 1, pp. 412–425, 2024.</w:t>
       </w:r>
     </w:p>
     <w:p>
       <w:pPr>
         <w:spacing w:line="276" w:lineRule="auto" w:after="120"/>
-        <w:ind w:left="720" w:hanging="720"/>
-      </w:pPr>
-      <w:r>
-        <w:rPr>
-          <w:rFonts w:ascii="Times New Roman" w:hAnsi="Times New Roman"/>
-          <w:sz w:val="24"/>
-        </w:rPr>
-        <w:t>Li, X., Zhao, B., &amp; Wang, C. (2023). Trust-aware graph neural networks for Internet of Things security. IEEE Internet of Things Journal, 10(8), 6945-6958.</w:t>
+        <w:ind w:left="576" w:hanging="576"/>
+      </w:pPr>
+      <w:r>
+        <w:rPr>
+          <w:rFonts w:ascii="Times New Roman" w:hAnsi="Times New Roman"/>
+          <w:sz w:val="22"/>
+        </w:rPr>
+        <w:t>[15] X. Li, B. Zhao, and C. Wang, "Trust-aware graph neural networks for Internet of Things security," IEEE Internet of Things Journal, vol. 10, no. 8, pp. 6945–6958, 2023.</w:t>
       </w:r>
     </w:p>
     <w:p>
       <w:pPr>
         <w:spacing w:line="276" w:lineRule="auto" w:after="120"/>
-        <w:ind w:left="720" w:hanging="720"/>
-      </w:pPr>
-      <w:r>
-        <w:rPr>
-          <w:rFonts w:ascii="Times New Roman" w:hAnsi="Times New Roman"/>
-          <w:sz w:val="24"/>
-        </w:rPr>
-        <w:t>Liu, S., Zhang, Y., &amp; Chen, H. (2023). Dynamic graph transformers for real-time network telemetry. IEEE Journal on Selected Areas in Communications, 41(5), 1432-1445.</w:t>
+        <w:ind w:left="576" w:hanging="576"/>
+      </w:pPr>
+      <w:r>
+        <w:rPr>
+          <w:rFonts w:ascii="Times New Roman" w:hAnsi="Times New Roman"/>
+          <w:sz w:val="22"/>
+        </w:rPr>
+        <w:t>[16] S. Liu, Y. Zhang, and H. Chen, "Dynamic graph transformers for real-time network telemetry," IEEE Journal on Selected Areas in Communications, vol. 41, no. 5, pp. 1432–1445, 2023.</w:t>
       </w:r>
     </w:p>
     <w:p>
       <w:pPr>
         <w:spacing w:line="276" w:lineRule="auto" w:after="120"/>
-        <w:ind w:left="720" w:hanging="720"/>
-      </w:pPr>
-      <w:r>
-        <w:rPr>
-          <w:rFonts w:ascii="Times New Roman" w:hAnsi="Times New Roman"/>
-          <w:sz w:val="24"/>
-        </w:rPr>
-        <w:t>Martinez, C., Gomez, F., &amp; Torres, R. (2024). Robustness of graph neural networks under adversarial alert poisoning. IEEE Transactions on Information Forensics and Security, 19, 812-825.</w:t>
+        <w:ind w:left="576" w:hanging="576"/>
+      </w:pPr>
+      <w:r>
+        <w:rPr>
+          <w:rFonts w:ascii="Times New Roman" w:hAnsi="Times New Roman"/>
+          <w:sz w:val="22"/>
+        </w:rPr>
+        <w:t>[17] C. Martinez, F. Gomez, and R. Torres, "Robustness of graph neural networks under adversarial alert poisoning," IEEE Transactions on Information Forensics and Security, vol. 19, pp. 812–825, 2024.</w:t>
       </w:r>
     </w:p>
     <w:p>
       <w:pPr>
         <w:spacing w:line="276" w:lineRule="auto" w:after="120"/>
-        <w:ind w:left="720" w:hanging="720"/>
-      </w:pPr>
-      <w:r>
-        <w:rPr>
-          <w:rFonts w:ascii="Times New Roman" w:hAnsi="Times New Roman"/>
-          <w:sz w:val="24"/>
-        </w:rPr>
-        <w:t>Park, J., Kim, H., &amp; Cho, Y. (2023). Spatial graph convolutions for destination port anomaly detection. Future Generation Computer Systems, 141, 230-241.</w:t>
+        <w:ind w:left="576" w:hanging="576"/>
+      </w:pPr>
+      <w:r>
+        <w:rPr>
+          <w:rFonts w:ascii="Times New Roman" w:hAnsi="Times New Roman"/>
+          <w:sz w:val="22"/>
+        </w:rPr>
+        <w:t>[18] J. Park, H. Kim, and Y. Cho, "Spatial graph convolutions for destination port anomaly detection," Future Generation Computer Systems, vol. 141, pp. 230–241, 2023.</w:t>
       </w:r>
     </w:p>
     <w:p>
       <w:pPr>
         <w:spacing w:line="276" w:lineRule="auto" w:after="120"/>
-        <w:ind w:left="720" w:hanging="720"/>
-      </w:pPr>
-      <w:r>
-        <w:rPr>
-          <w:rFonts w:ascii="Times New Roman" w:hAnsi="Times New Roman"/>
-          <w:sz w:val="24"/>
-        </w:rPr>
-        <w:t>Patel, A., Kumar, N., &amp; Shah, M. (2021). Heterogeneous graph neural networks for network anomaly detection. Pattern Recognition, 118, 108021.</w:t>
+        <w:ind w:left="576" w:hanging="576"/>
+      </w:pPr>
+      <w:r>
+        <w:rPr>
+          <w:rFonts w:ascii="Times New Roman" w:hAnsi="Times New Roman"/>
+          <w:sz w:val="22"/>
+        </w:rPr>
+        <w:t>[19] A. Patel, N. Kumar, and M. Shah, "Heterogeneous graph neural networks for network anomaly detection," Pattern Recognition, vol. 118, p. 108021, 2021.</w:t>
       </w:r>
     </w:p>
     <w:p>
       <w:pPr>
         <w:spacing w:line="276" w:lineRule="auto" w:after="120"/>
-        <w:ind w:left="720" w:hanging="720"/>
-      </w:pPr>
-      <w:r>
-        <w:rPr>
-          <w:rFonts w:ascii="Times New Roman" w:hAnsi="Times New Roman"/>
-          <w:sz w:val="24"/>
-        </w:rPr>
-        <w:t>Singh, K., Verma, R., &amp; Agarwal, P. (2023). Attention-based alert correlation in security information and event management (SIEM). IEEE Access, 11, 35120-35132.</w:t>
+        <w:ind w:left="576" w:hanging="576"/>
+      </w:pPr>
+      <w:r>
+        <w:rPr>
+          <w:rFonts w:ascii="Times New Roman" w:hAnsi="Times New Roman"/>
+          <w:sz w:val="22"/>
+        </w:rPr>
+        <w:t>[20] K. Singh, R. Verma, and P. Agarwal, "Attention-based alert correlation in security information and event management (SIEM)," IEEE Access, vol. 11, pp. 35120–35132, 2023.</w:t>
       </w:r>
     </w:p>
     <w:p>
       <w:pPr>
         <w:spacing w:line="276" w:lineRule="auto" w:after="120"/>
-        <w:ind w:left="720" w:hanging="720"/>
-      </w:pPr>
-      <w:r>
-        <w:rPr>
-          <w:rFonts w:ascii="Times New Roman" w:hAnsi="Times New Roman"/>
-          <w:sz w:val="24"/>
-        </w:rPr>
-        <w:t>Stoker, J. J. (1957). Water waves: The mathematical theory with applications. Interscience Publishers, New York, 520.</w:t>
+        <w:ind w:left="576" w:hanging="576"/>
+      </w:pPr>
+      <w:r>
+        <w:rPr>
+          <w:rFonts w:ascii="Times New Roman" w:hAnsi="Times New Roman"/>
+          <w:sz w:val="22"/>
+        </w:rPr>
+        <w:t>[21] J. J. Stoker, Water Waves: The Mathematical Theory with Applications. New York: Interscience Publishers, p. 520, 1957.</w:t>
       </w:r>
     </w:p>
     <w:p>
       <w:pPr>
         <w:spacing w:line="276" w:lineRule="auto" w:after="120"/>
-        <w:ind w:left="720" w:hanging="720"/>
-      </w:pPr>
-      <w:r>
-        <w:rPr>
-          <w:rFonts w:ascii="Times New Roman" w:hAnsi="Times New Roman"/>
-          <w:sz w:val="24"/>
-        </w:rPr>
-        <w:t>Sun, T., Liu, Y., &amp; Wu, Z. (2021). Iterative Jacobi relaxation methods for quadratic graph optimization. SIAM Journal on Matrix Analysis and Applications, 42(3), 1120-1142.</w:t>
+        <w:ind w:left="576" w:hanging="576"/>
+      </w:pPr>
+      <w:r>
+        <w:rPr>
+          <w:rFonts w:ascii="Times New Roman" w:hAnsi="Times New Roman"/>
+          <w:sz w:val="22"/>
+        </w:rPr>
+        <w:t>[22] T. Sun, Y. Liu, and Z. Wu, "Iterative Jacobi relaxation methods for quadratic graph optimization," SIAM Journal on Matrix Analysis and Applications, vol. 42, no. 3, pp. 1120–1142, 2021.</w:t>
       </w:r>
     </w:p>
     <w:p>
       <w:pPr>
         <w:spacing w:line="276" w:lineRule="auto" w:after="120"/>
-        <w:ind w:left="720" w:hanging="720"/>
-      </w:pPr>
-      <w:r>
-        <w:rPr>
-          <w:rFonts w:ascii="Times New Roman" w:hAnsi="Times New Roman"/>
-          <w:sz w:val="24"/>
-        </w:rPr>
-        <w:t>Tatavarti, R. V. S. N., &amp; Huntley, D. A. (1987). Wave reflection at beaches. Proceedings of the Canadian Coastal Conference, Quebec City, 241-255.</w:t>
+        <w:ind w:left="576" w:hanging="576"/>
+      </w:pPr>
+      <w:r>
+        <w:rPr>
+          <w:rFonts w:ascii="Times New Roman" w:hAnsi="Times New Roman"/>
+          <w:sz w:val="22"/>
+        </w:rPr>
+        <w:t>[23] R. V. S. N. Tatavarti and D. A. Huntley, "Wave reflection at beaches," in Proc. Canadian Coastal Conf., Quebec City, pp. 241–255, 1987.</w:t>
       </w:r>
     </w:p>
     <w:p>
       <w:pPr>
         <w:spacing w:line="276" w:lineRule="auto" w:after="120"/>
-        <w:ind w:left="720" w:hanging="720"/>
-      </w:pPr>
-      <w:r>
-        <w:rPr>
-          <w:rFonts w:ascii="Times New Roman" w:hAnsi="Times New Roman"/>
-          <w:sz w:val="24"/>
-        </w:rPr>
-        <w:t>Veličković, P., Cucurull, G., Casanova, A., Romero, A., Liò, P., &amp; Bengio, Y. (2018). Graph attention networks. International Conference on Learning Representations (ICLR).</w:t>
+        <w:ind w:left="576" w:hanging="576"/>
+      </w:pPr>
+      <w:r>
+        <w:rPr>
+          <w:rFonts w:ascii="Times New Roman" w:hAnsi="Times New Roman"/>
+          <w:sz w:val="22"/>
+        </w:rPr>
+        <w:t>[24] P. Veličković, G. Cucurull, A. Casanova, A. Romero, P. Liò, and Y. Bengio, "Graph attention networks," in Proc. Int. Conf. Learn. Represent. (ICLR), 2018.</w:t>
       </w:r>
     </w:p>
     <w:p>
       <w:pPr>
         <w:spacing w:line="276" w:lineRule="auto" w:after="120"/>
-        <w:ind w:left="720" w:hanging="720"/>
-      </w:pPr>
-      <w:r>
-        <w:rPr>
-          <w:rFonts w:ascii="Times New Roman" w:hAnsi="Times New Roman"/>
-          <w:sz w:val="24"/>
-        </w:rPr>
-        <w:t>Wallace, J. M., &amp; Dickinson, R. E. (1972). Empirical orthogonal representation of time series in the frequency domain. Journal of Applied Meteorology, 11(6), 887-892.</w:t>
+        <w:ind w:left="576" w:hanging="576"/>
+      </w:pPr>
+      <w:r>
+        <w:rPr>
+          <w:rFonts w:ascii="Times New Roman" w:hAnsi="Times New Roman"/>
+          <w:sz w:val="22"/>
+        </w:rPr>
+        <w:t>[25] J. M. Wallace and R. E. Dickinson, "Empirical orthogonal representation of time series in the frequency domain," Journal of Applied Meteorology, vol. 11, no. 6, pp. 887–892, 1972.</w:t>
       </w:r>
     </w:p>
     <w:p>
       <w:pPr>
         <w:spacing w:line="276" w:lineRule="auto" w:after="120"/>
-        <w:ind w:left="720" w:hanging="720"/>
-      </w:pPr>
-      <w:r>
-        <w:rPr>
-          <w:rFonts w:ascii="Times New Roman" w:hAnsi="Times New Roman"/>
-          <w:sz w:val="24"/>
-        </w:rPr>
-        <w:t>Wang, H., Zhao, M., &amp; Li, Y. (2023). GraphDIDS: Distributed graph neural network for intrusion detection in enterprise networks. IEEE Transactions on Dependable and Secure Computing, 20(3), 2341-2354.</w:t>
+        <w:ind w:left="576" w:hanging="576"/>
+      </w:pPr>
+      <w:r>
+        <w:rPr>
+          <w:rFonts w:ascii="Times New Roman" w:hAnsi="Times New Roman"/>
+          <w:sz w:val="22"/>
+        </w:rPr>
+        <w:t>[26] H. Wang, M. Zhao, and Y. Li, "GraphDIDS: Distributed graph neural network for intrusion detection in enterprise networks," IEEE Transactions on Dependable and Secure Computing, vol. 20, no. 3, pp. 2341–2354, 2023.</w:t>
       </w:r>
     </w:p>
     <w:p>
       <w:pPr>
         <w:spacing w:line="276" w:lineRule="auto" w:after="120"/>
-        <w:ind w:left="720" w:hanging="720"/>
-      </w:pPr>
-      <w:r>
-        <w:rPr>
-          <w:rFonts w:ascii="Times New Roman" w:hAnsi="Times New Roman"/>
-          <w:sz w:val="24"/>
-        </w:rPr>
-        <w:t>Wu, Q., Zhang, L., &amp; Tan, X. (2021). Inductive representation learning on dynamic traffic graphs. ACM Transactions on Intelligent Systems and Technology, 12(6), 1-22.</w:t>
+        <w:ind w:left="576" w:hanging="576"/>
+      </w:pPr>
+      <w:r>
+        <w:rPr>
+          <w:rFonts w:ascii="Times New Roman" w:hAnsi="Times New Roman"/>
+          <w:sz w:val="22"/>
+        </w:rPr>
+        <w:t>[27] Q. Wu, L. Zhang, and X. Tan, "Inductive representation learning on dynamic traffic graphs," ACM Transactions on Intelligent Systems and Technology, vol. 12, no. 6, pp. 1–22, 2021.</w:t>
       </w:r>
     </w:p>
     <w:p>
       <w:pPr>
         <w:spacing w:line="276" w:lineRule="auto" w:after="120"/>
-        <w:ind w:left="720" w:hanging="720"/>
-      </w:pPr>
-      <w:r>
-        <w:rPr>
-          <w:rFonts w:ascii="Times New Roman" w:hAnsi="Times New Roman"/>
-          <w:sz w:val="24"/>
-        </w:rPr>
-        <w:t>Xu, B., Zhao, K., &amp; Sun, L. (2022). Metric learning and prototype networks for unknown network attacks. Computer Networks, 205, 108754.</w:t>
+        <w:ind w:left="576" w:hanging="576"/>
+      </w:pPr>
+      <w:r>
+        <w:rPr>
+          <w:rFonts w:ascii="Times New Roman" w:hAnsi="Times New Roman"/>
+          <w:sz w:val="22"/>
+        </w:rPr>
+        <w:t>[28] B. Xu, K. Zhao, and L. Sun, "Metric learning and prototype networks for unknown network attacks," Computer Networks, vol. 205, p. 108754, 2022.</w:t>
       </w:r>
     </w:p>
     <w:p>
       <w:pPr>
         <w:spacing w:line="276" w:lineRule="auto" w:after="120"/>
-        <w:ind w:left="720" w:hanging="720"/>
-      </w:pPr>
-      <w:r>
-        <w:rPr>
-          <w:rFonts w:ascii="Times New Roman" w:hAnsi="Times New Roman"/>
-          <w:sz w:val="24"/>
-        </w:rPr>
-        <w:t>Yang, Z., Liu, X., &amp; Zhou, W. (2022). Graph episodic memory for continual anomaly detection. IEEE Transactions on Knowledge and Data Engineering, 34(11), 5412-5425.</w:t>
+        <w:ind w:left="576" w:hanging="576"/>
+      </w:pPr>
+      <w:r>
+        <w:rPr>
+          <w:rFonts w:ascii="Times New Roman" w:hAnsi="Times New Roman"/>
+          <w:sz w:val="22"/>
+        </w:rPr>
+        <w:t>[29] Z. Yang, X. Liu, and W. Zhou, "Graph episodic memory for continual anomaly detection," IEEE Transactions on Knowledge and Data Engineering, vol. 34, no. 11, pp. 5412–5425, 2022.</w:t>
       </w:r>
     </w:p>
     <w:p>
       <w:pPr>
         <w:spacing w:line="276" w:lineRule="auto" w:after="120"/>
-        <w:ind w:left="720" w:hanging="720"/>
-      </w:pPr>
-      <w:r>
-        <w:rPr>
-          <w:rFonts w:ascii="Times New Roman" w:hAnsi="Times New Roman"/>
-          <w:sz w:val="24"/>
-        </w:rPr>
-        <w:t>Zhang, J., Wang, R., &amp; Chen, Y. (2022). Zero-day intrusion detection via open-set pattern recognition. IEEE Transactions on Cybernetics, 52(9), 9821-9834.</w:t>
+        <w:ind w:left="576" w:hanging="576"/>
+      </w:pPr>
+      <w:r>
+        <w:rPr>
+          <w:rFonts w:ascii="Times New Roman" w:hAnsi="Times New Roman"/>
+          <w:sz w:val="22"/>
+        </w:rPr>
+        <w:t>[30] J. Zhang, R. Wang, and Y. Chen, "Zero-day intrusion detection via open-set pattern recognition," IEEE Transactions on Cybernetics, vol. 52, no. 9, pp. 9821–9834, 2022.</w:t>
       </w:r>
     </w:p>
     <w:p>
       <w:pPr>
         <w:spacing w:line="276" w:lineRule="auto" w:after="120"/>
-        <w:ind w:left="720" w:hanging="720"/>
-      </w:pPr>
-      <w:r>
-        <w:rPr>
-          <w:rFonts w:ascii="Times New Roman" w:hAnsi="Times New Roman"/>
-          <w:sz w:val="24"/>
-        </w:rPr>
-        <w:t>Zhao, Y., Li, Q., &amp; Wang, J. (2022). Temporal graph architecture for dynamic network intrusion detection. IEEE Transactions on Information Forensics and Security, 17, 1892-1905.</w:t>
+        <w:ind w:left="576" w:hanging="576"/>
+      </w:pPr>
+      <w:r>
+        <w:rPr>
+          <w:rFonts w:ascii="Times New Roman" w:hAnsi="Times New Roman"/>
+          <w:sz w:val="22"/>
+        </w:rPr>
+        <w:t>[31] Y. Zhao, Q. Li, and J. Wang, "Temporal graph architecture for dynamic network intrusion detection," IEEE Transactions on Information Forensics and Security, vol. 17, pp. 1892–1905, 2022.</w:t>
       </w:r>
     </w:p>
     <w:p>
       <w:pPr>
         <w:spacing w:line="276" w:lineRule="auto" w:after="120"/>
-        <w:ind w:left="720" w:hanging="720"/>
-      </w:pPr>
-      <w:r>
-        <w:rPr>
-          <w:rFonts w:ascii="Times New Roman" w:hAnsi="Times New Roman"/>
-          <w:sz w:val="24"/>
-        </w:rPr>
-        <w:t>Zhou, M., Zhang, K., &amp; Liu, P. (2021). E-GraphSAGE: A graph neural network for edge-centric intrusion detection. IEEE Transactions on Network and Service Management, 18(4), 4210-4222.</w:t>
+        <w:ind w:left="576" w:hanging="576"/>
+      </w:pPr>
+      <w:r>
+        <w:rPr>
+          <w:rFonts w:ascii="Times New Roman" w:hAnsi="Times New Roman"/>
+          <w:sz w:val="22"/>
+        </w:rPr>
+        <w:t>[32] M. Zhou, K. Zhang, and P. Liu, "E-GraphSAGE: A graph neural network for edge-centric intrusion detection," IEEE Transactions on Network and Service Management, vol. 18, no. 4, pp. 4210–4222, 2021.</w:t>
       </w:r>
     </w:p>
     <w:sectPr>

</xml_diff>

<commit_message>
Elaborate Chapter 2 sections 2.1 to 2.5 with extensive academic prose
</commit_message>
<xml_diff>
--- a/ATGC_MACIDS_Elaborate_Project_Report.docx
+++ b/ATGC_MACIDS_Elaborate_Project_Report.docx
@@ -4194,7 +4194,24 @@
           <w:sz w:val="24"/>
           <w:u w:val="none"/>
         </w:rPr>
-        <w:t>Network anomaly detection has been an active area of computer science research for over three decades. Early systems developed during the 1990s relied on heuristic rule sets, expert engines, and statistical thresholding (Denning, 1987). However, as network speeds expanded exponentially and malicious payloads evolved evasive capabilities, rule-based engines proved rigid, requiring constant manual updates by cybersecurity experts.</w:t>
+        <w:t>Network anomaly detection has been a central pillar of computer science and cybersecurity research for more than three decades. The early foundations of network defense, established during the late 1980s and 1990s, relied almost exclusively on static signature-matching engines, heuristic rule bases, and simple statistical thresholding models (Denning, 1987). Early commercial and open-source systems, such as Snort and Bro (now Zeek), operated by inspecting incoming packet headers and raw byte payloads against an administrative database of known attack signatures. While signature-matching architectures demonstrated exceptionally high precision and minimal processing latency when evaluating previously documented threats, they exhibited fundamental systemic vulnerabilities in modern dynamic enterprise networks.</w:t>
+      </w:r>
+    </w:p>
+    <w:p>
+      <w:pPr>
+        <w:spacing w:after="120" w:before="0" w:line="360" w:lineRule="auto"/>
+        <w:jc w:val="both"/>
+      </w:pPr>
+      <w:r>
+        <w:rPr>
+          <w:rFonts w:ascii="Times New Roman" w:hAnsi="Times New Roman"/>
+          <w:b w:val="0"/>
+          <w:i w:val="0"/>
+          <w:color w:val="000000"/>
+          <w:sz w:val="24"/>
+          <w:u w:val="none"/>
+        </w:rPr>
+        <w:t>As global network speeds expanded from megabits to multi-gigabits per second, and network protocols grew increasingly complex, rule-based detection engines proved excessively rigid. Maintaining static signature databases required continuous manual intervention by specialized security analysts, creating a critical vulnerability window between the initial emergence of a novel exploit and the deployment of its corresponding signature rule. Furthermore, modern cyber threat actors routinely employ polymorphic code generation, encrypted payload encapsulation (SSL/TLS), and protocol obfuscation techniques explicitly engineered to evade signature matching. These structural limitations catalyzed a decisive shift toward data-driven anomaly detection models capable of learning baseline profiles of normal network communications and autonomously identifying malicious deviations without relying on hardcoded threat signatures.</w:t>
       </w:r>
     </w:p>
     <w:p>
@@ -4228,7 +4245,7 @@
           <w:sz w:val="24"/>
           <w:u w:val="none"/>
         </w:rPr>
-        <w:t>The application of machine learning to NIDS gained significant momentum with benchmark datasets such as KDD Cup 99, NSL-KDD, and UNSW-NB15. Shallow classifiers—including Naive Bayes, Decision Trees, Random Forests, and Support Vector Machines—demonstrated high accuracy on static flow features. Random Forests in particular achieved high tabular precision due to ensemble decision tree aggregation (Breiman, 2001). However, shallow models cannot capture temporal packet order or spatial network topologies.</w:t>
+        <w:t>The application of Machine Learning (ML) to Network Intrusion Detection Systems (NIDS) gained significant academic momentum following the release of standardized benchmark flow datasets, including KDD Cup 99, NSL-KDD, UNSW-NB15, and the CICIDS series. Early research focused on applying shallow supervised learning algorithms—such as Naive Bayes, Decision Trees (C4.5/CART), Random Forests, Support Vector Machines (SVM), and Gradient Boosting Machines (XGBoost/LightGBM)—to tabular network flow features. Shallow classifiers demonstrated strong performance on static benchmark tables; Random Forests in particular achieved high tabular precision by aggregating decision paths across ensembles of decision trees (Breiman, 2001). Shallow models offered distinct operational advantages, including fast training times, low computational memory overhead, and clear feature importance attributions.</w:t>
       </w:r>
     </w:p>
     <w:p>
@@ -4245,7 +4262,24 @@
           <w:sz w:val="24"/>
           <w:u w:val="none"/>
         </w:rPr>
-        <w:t>To address temporal dependencies, researchers introduced Deep Learning architectures. 1D Convolutional Neural Networks (1D-CNN) and Recurrent Neural Networks (LSTM/GRU) treat packet sequences as temporal time-series. While deep sequential architectures effectively model flow dynamics, they require significant computational power and exhibit high latency, making them difficult to deploy on edge switches or high-speed routers.</w:t>
+        <w:t>However, shallow machine learning algorithms suffer from a fundamental structural flaw: they evaluate network packet flows as isolated, independent, and identically distributed (i.i.d.) tabular data points. In operational networks, flow records are inherently relational and dynamic; traffic exchanged between a source IP and a destination IP forms interconnected spatial graph topologies and sequential time-series patterns. By treating flow records independently, shallow models cannot capture temporal packet sequences, inter-packet arrival jitter, or structural multi-host communication patterns, rendering them blind to coordinated multi-stage attacks such as distributed port scans and lateral movement.</w:t>
+      </w:r>
+    </w:p>
+    <w:p>
+      <w:pPr>
+        <w:spacing w:after="120" w:before="0" w:line="360" w:lineRule="auto"/>
+        <w:jc w:val="both"/>
+      </w:pPr>
+      <w:r>
+        <w:rPr>
+          <w:rFonts w:ascii="Times New Roman" w:hAnsi="Times New Roman"/>
+          <w:b w:val="0"/>
+          <w:i w:val="0"/>
+          <w:color w:val="000000"/>
+          <w:sz w:val="24"/>
+          <w:u w:val="none"/>
+        </w:rPr>
+        <w:t>To address temporal packet dependencies, researchers introduced Deep Learning (DL) sequence architectures. 1D Convolutional Neural Networks (1D-CNN) and Recurrent Neural Networks (RNNs, LSTMs, GRUs) process raw packet byte sequences and temporal flow statistics as time-series data (Chen et al., 2020). Unsupervised Autoencoder architectures utilize reconstruction error thresholds to detect anomalous flow deviations. While deep sequential models successfully capture temporal flow dynamics, they suffer from prohibitive computational complexity and high memory latency. Recurrent LSTM cells require sequential state updates that cannot be parallelized effectively on high-speed network switches, resulting in per-sample processing latencies (&gt;10 ms) that exceed real-time edge gateway tolerances.</w:t>
       </w:r>
     </w:p>
     <w:p>
@@ -4279,7 +4313,58 @@
           <w:sz w:val="24"/>
           <w:u w:val="none"/>
         </w:rPr>
-        <w:t>The emergence of Graph Neural Networks (GNNs) enabled researchers to explicitly model communication topologies. Graph Convolutional Networks (GCN) approximate spectral graph convolutions, enabling nodes to aggregate feature representations from their immediate topological neighbors (Kipf &amp; Welling, 2017). Graph Attention Networks (GAT) improve upon GCNs by introducing self-attention mechanisms, allowing nodes to assign non-uniform weights to different neighbors (Veličković et al., 2018). GraphSAGE introduces inductive representation learning by sampling fixed-size neighborhood subgraphs, allowing GNNs to generalize to previously unseen nodes (Hamilton et al., 2017).</w:t>
+        <w:t>The emergence of Graph Neural Networks (GNNs) enabled researchers to explicitly represent communication networks as relational graphs G = (V, E), where nodes V represent IP endpoints, hosts, or destination ports, and directed edges E represent active communication flows. Graph representation learning allows models to capture topological structural context that remains invisible to standard tabular classifiers.</w:t>
+      </w:r>
+    </w:p>
+    <w:p>
+      <w:pPr>
+        <w:spacing w:after="120" w:before="0" w:line="360" w:lineRule="auto"/>
+        <w:jc w:val="both"/>
+      </w:pPr>
+      <w:r>
+        <w:rPr>
+          <w:rFonts w:ascii="Times New Roman" w:hAnsi="Times New Roman"/>
+          <w:b w:val="0"/>
+          <w:i w:val="0"/>
+          <w:color w:val="000000"/>
+          <w:sz w:val="24"/>
+          <w:u w:val="none"/>
+        </w:rPr>
+        <w:t>Early graph-based intrusion detection frameworks applied Graph Convolutional Networks (GCN), which approximate spectral graph convolutions to aggregate feature representations from immediate topological neighbors (Kipf &amp; Welling, 2017). GCNs demonstrated success in identifying distributed reconnaissance and host scanning tactics. However, GCNs utilize fixed, isotropic neighborhood aggregation weights based solely on graph degree matrices, making them incapable of dynamically prioritizing critical communication channels.</w:t>
+      </w:r>
+    </w:p>
+    <w:p>
+      <w:pPr>
+        <w:spacing w:after="120" w:before="0" w:line="360" w:lineRule="auto"/>
+        <w:jc w:val="both"/>
+      </w:pPr>
+      <w:r>
+        <w:rPr>
+          <w:rFonts w:ascii="Times New Roman" w:hAnsi="Times New Roman"/>
+          <w:b w:val="0"/>
+          <w:i w:val="0"/>
+          <w:color w:val="000000"/>
+          <w:sz w:val="24"/>
+          <w:u w:val="none"/>
+        </w:rPr>
+        <w:t>To overcome the isotropic limitation of GCNs, Graph Attention Networks (GAT) introduced spatial self-attention mechanisms (Veličković et al., 2018). GAT nodes assign dynamic, non-uniform attention coefficients to different topological neighbors based on pairwise feature dot-products. Subsequently, inductive graph models such as GraphSAGE (Hamilton et al., 2017) and E-GraphSAGE (Zhou et al., 2021) introduced fixed-size neighborhood sampling and edge-centric feature aggregation, allowing GNNs to generalize efficiently to previously unseen host nodes in dynamic networks. More recently, Dynamic Graph Transformers (Liu et al., 2023) incorporated temporal packet arrival timestamps directly into multi-head attention maps.</w:t>
+      </w:r>
+    </w:p>
+    <w:p>
+      <w:pPr>
+        <w:spacing w:after="120" w:before="0" w:line="360" w:lineRule="auto"/>
+        <w:jc w:val="both"/>
+      </w:pPr>
+      <w:r>
+        <w:rPr>
+          <w:rFonts w:ascii="Times New Roman" w:hAnsi="Times New Roman"/>
+          <w:b w:val="0"/>
+          <w:i w:val="0"/>
+          <w:color w:val="000000"/>
+          <w:sz w:val="24"/>
+          <w:u w:val="none"/>
+        </w:rPr>
+        <w:t>Despite these advancements, standard GNN models possess a critical security vulnerability: they operate under the assumption that all topological neighbors in the graph are honest and reliable. If an internal network host becomes compromised by malware, it can inject corrupted, malicious feature representations into GNN spatial message passing—a phenomenon known as Alert Poisoning (Martinez et al., 2024). Alert poisoning corrupts the hidden representations of surrounding benign hosts, triggering widespread false alarms across the enterprise.</w:t>
       </w:r>
     </w:p>
     <w:p>
@@ -4313,7 +4398,41 @@
           <w:sz w:val="24"/>
           <w:u w:val="none"/>
         </w:rPr>
-        <w:t>Multi-Agent Systems (MAS) treat network entities as autonomous computational agents capable of local sensing, reasoning, and collaborative decision-making. Integrating trust models into multi-agent systems allows network nodes to evaluate the reliability of their peers over time based on observed interaction history. However, traditional MAS trust models rely on heuristic reputation tables that cannot be integrated directly into gradient-based neural network backpropagation.</w:t>
+        <w:t>Multi-Agent Systems (MAS) treat individual network entities—such as host computers, routers, firewall gateways, and security sensors—as autonomous computational agents capable of local environmental sensing, reasoning, and collaborative decision-making. In distributed security architectures, multi-agent frameworks enable localized threat monitoring without requiring centralized payload inspection (Kumar et al., 2024).</w:t>
+      </w:r>
+    </w:p>
+    <w:p>
+      <w:pPr>
+        <w:spacing w:after="120" w:before="0" w:line="360" w:lineRule="auto"/>
+        <w:jc w:val="both"/>
+      </w:pPr>
+      <w:r>
+        <w:rPr>
+          <w:rFonts w:ascii="Times New Roman" w:hAnsi="Times New Roman"/>
+          <w:b w:val="0"/>
+          <w:i w:val="0"/>
+          <w:color w:val="000000"/>
+          <w:sz w:val="24"/>
+          <w:u w:val="none"/>
+        </w:rPr>
+        <w:t>To evaluate node reliability over time, multi-agent security frameworks integrate Dynamic Trust Management models. Trust evaluation algorithms—such as Subjective Logic, Beta Reputation systems, and Dempster-Shafer evidence theory—calculate host trust scores T_i in [0.05, 1.0] based on observed interaction history, packet rate consistency, prediction uncertainty, and peer feedback (Li et al., 2023; Das et al., 2024). Hosts exhibiting anomalous or erratic communication behaviors experience rapid trust decay, signaling potential compromise.</w:t>
+      </w:r>
+    </w:p>
+    <w:p>
+      <w:pPr>
+        <w:spacing w:after="120" w:before="0" w:line="360" w:lineRule="auto"/>
+        <w:jc w:val="both"/>
+      </w:pPr>
+      <w:r>
+        <w:rPr>
+          <w:rFonts w:ascii="Times New Roman" w:hAnsi="Times New Roman"/>
+          <w:b w:val="0"/>
+          <w:i w:val="0"/>
+          <w:color w:val="000000"/>
+          <w:sz w:val="24"/>
+          <w:u w:val="none"/>
+        </w:rPr>
+        <w:t>However, existing multi-agent trust frameworks suffer from a major integration limitation: traditional reputation models rely on heuristic rule tables or discrete reputation matrices that are non-differentiable. Because discrete trust tables cannot compute backpropagation gradients (∇_θ L), traditional trust evaluation cannot be integrated directly into neural network loss functions or GNN layer optimization. This highlights the necessity for a differentiable Dynamic Trust Evolution Network (DTEN) that seamlessly unifies continuous trust modeling with backpropagatable GNN message passing.</w:t>
       </w:r>
     </w:p>
     <w:p>
@@ -4347,7 +4466,58 @@
           <w:sz w:val="24"/>
           <w:u w:val="none"/>
         </w:rPr>
-        <w:t>Zero-day intrusion detection focuses on identifying previously un-encountered attack patterns that lack existing signatures or training labels. Open-set recognition methods utilize Extreme Value Theory (EVT), autoencoder reconstruction errors, or entropy-based prototype distance metrics to identify out-of-distribution flow samples.</w:t>
+        <w:t>Zero-day intrusion detection focuses on identifying novel, previously un-encountered cyber attack patterns that lack existing signatures or training category labels. Because zero-day exploits utilize undocumented software vulnerabilities, they represent the highest operational risk to enterprise subnets (Zhang et al., 2022).</w:t>
+      </w:r>
+    </w:p>
+    <w:p>
+      <w:pPr>
+        <w:spacing w:after="120" w:before="0" w:line="360" w:lineRule="auto"/>
+        <w:jc w:val="both"/>
+      </w:pPr>
+      <w:r>
+        <w:rPr>
+          <w:rFonts w:ascii="Times New Roman" w:hAnsi="Times New Roman"/>
+          <w:b w:val="0"/>
+          <w:i w:val="0"/>
+          <w:color w:val="000000"/>
+          <w:sz w:val="24"/>
+          <w:u w:val="none"/>
+        </w:rPr>
+        <w:t>Conventional deep learning classifiers operate under a Closed-Set Assumption. Closed-set neural networks utilize standard Softmax activation layers that normalize output logit scores into a probability distribution summing to 1.0 across known training classes. When presented with a novel zero-day attack vector outside its training distribution, a closed-set classifier is forced to assign the unknown input to one of the pre-defined training categories, frequently misclassifying severe threats as benign traffic with high statistical confidence.</w:t>
+      </w:r>
+    </w:p>
+    <w:p>
+      <w:pPr>
+        <w:spacing w:after="120" w:before="0" w:line="360" w:lineRule="auto"/>
+        <w:jc w:val="both"/>
+      </w:pPr>
+      <w:r>
+        <w:rPr>
+          <w:rFonts w:ascii="Times New Roman" w:hAnsi="Times New Roman"/>
+          <w:b w:val="0"/>
+          <w:i w:val="0"/>
+          <w:color w:val="000000"/>
+          <w:sz w:val="24"/>
+          <w:u w:val="none"/>
+        </w:rPr>
+        <w:t>To solve the closed-set limitation, researchers have investigated Open-Set Recognition (OSR) and out-of-distribution (OOD) detection techniques (Xu et al., 2022). Open-set frameworks employ Extreme Value Theory (EVT), Weibull tail fitting, autoencoder reconstruction energy, or logit entropy thresholding to quantify prediction uncertainty. Inputs exhibiting high classification entropy or large distance from normal class prototypes are flagged as novel Zero-Day anomalies.</w:t>
+      </w:r>
+    </w:p>
+    <w:p>
+      <w:pPr>
+        <w:spacing w:after="120" w:before="0" w:line="360" w:lineRule="auto"/>
+        <w:jc w:val="both"/>
+      </w:pPr>
+      <w:r>
+        <w:rPr>
+          <w:rFonts w:ascii="Times New Roman" w:hAnsi="Times New Roman"/>
+          <w:b w:val="0"/>
+          <w:i w:val="0"/>
+          <w:color w:val="000000"/>
+          <w:sz w:val="24"/>
+          <w:u w:val="none"/>
+        </w:rPr>
+        <w:t>Furthermore, existing open-set detection models function purely as passive analytical tools, identifying anomalies without executing automatic containment. Bridging the gap between open-set zero-day detection and immediate, autonomous Security Information and Event Management (SIEM) response containment—such as dynamic host isolation and border firewall rule generation—remains a critical requirement for modern resilient network defense architectures.</w:t>
       </w:r>
     </w:p>
     <w:p>

</xml_diff>

<commit_message>
Update VIT M.Tech Project Reports with Guide Name Dr. Joe Dhanith P R
</commit_message>
<xml_diff>
--- a/ATGC_MACIDS_Elaborate_Project_Report.docx
+++ b/ATGC_MACIDS_Elaborate_Project_Report.docx
@@ -332,7 +332,7 @@
           <w:sz w:val="24"/>
           <w:u w:val="none"/>
         </w:rPr>
-        <w:t>I hereby declare that the thesis entitled "ATGC-MACIDS: ADAPTIVE TRUST GRAPH CONSENSUS MULTI-AGENT INTRUSION DETECTION SYSTEM" submitted by me, for the award of the degree of M.Tech. (Integrated) Computer Science and Engineering with Specialization in Business Analytics, Vellore Institute of Technology, Chennai, is a record of bonafide work carried out by me under the supervision of Dr. [GUIDE_NAME].</w:t>
+        <w:t>I hereby declare that the thesis entitled "ATGC-MACIDS: ADAPTIVE TRUST GRAPH CONSENSUS MULTI-AGENT INTRUSION DETECTION SYSTEM" submitted by me, for the award of the degree of M.Tech. (Integrated) Computer Science and Engineering with Specialization in Business Analytics, Vellore Institute of Technology, Chennai, is a record of bonafide work carried out by me under the supervision of Dr. Joe Dhanith P R.</w:t>
       </w:r>
     </w:p>
     <w:p>
@@ -507,7 +507,7 @@
           <w:sz w:val="24"/>
           <w:u w:val="none"/>
         </w:rPr>
-        <w:t>Name: Dr. [GUIDE_NAME]</w:t>
+        <w:t>Name: Dr. Joe Dhanith P R</w:t>
       </w:r>
     </w:p>
     <w:p>
@@ -756,7 +756,7 @@
           <w:sz w:val="24"/>
           <w:u w:val="none"/>
         </w:rPr>
-        <w:t>It is my pleasure to express with a deep sense of gratitude to Dr. [GUIDE_NAME], Associate Professor, School of Computer Science and Engineering, Vellore Institute of Technology, Chennai, for his/her constant guidance, continual encouragement, and understanding; more than all, he/she taught me patience in my endeavour. My association with him/her is not confined to academics only, but it is a great opportunity for my part of work to interact with an intellectual and expert in the field of Artificial Intelligence, Graph Neural Networks, and Cybersecurity.</w:t>
+        <w:t>It is my pleasure to express with a deep sense of gratitude to Dr. Joe Dhanith P R, Associate Professor, School of Computer Science and Engineering, Vellore Institute of Technology, Chennai, for his/her constant guidance, continual encouragement, and understanding; more than all, he/she taught me patience in my endeavour. My association with him/her is not confined to academics only, but it is a great opportunity for my part of work to interact with an intellectual and expert in the field of Artificial Intelligence, Graph Neural Networks, and Cybersecurity.</w:t>
       </w:r>
     </w:p>
     <w:p>

</xml_diff>

<commit_message>
Fix candidate name S. BHAVYA SRI and Register No 22MIA1010 formatting across all preliminary report pages
</commit_message>
<xml_diff>
--- a/ATGC_MACIDS_Elaborate_Project_Report.docx
+++ b/ATGC_MACIDS_Elaborate_Project_Report.docx
@@ -67,7 +67,7 @@
           <w:sz w:val="28"/>
           <w:u w:val="none"/>
         </w:rPr>
-        <w:t>S.BHAVYA SRI</w:t>
+        <w:t>S. BHAVYA SRI</w:t>
       </w:r>
     </w:p>
     <w:p>
@@ -84,7 +84,7 @@
           <w:sz w:val="24"/>
           <w:u w:val="none"/>
         </w:rPr>
-        <w:t>(Reg. No: 22MIA1010)</w:t>
+        <w:t>REGISTER NO: 22MIA1010</w:t>
       </w:r>
     </w:p>
     <w:p>
@@ -295,9 +295,9 @@
           <w:sz w:val="26"/>
           <w:u w:val="none"/>
         </w:rPr>
-        <w:t>S.BHAVYA SRI</w:t>
+        <w:t>S. BHAVYA SRI</w:t>
         <w:br/>
-        <w:t>(Reg. No: 22MIA1010)</w:t>
+        <w:t>REGISTER NO: 22MIA1010</w:t>
       </w:r>
     </w:p>
     <w:p>
@@ -479,9 +479,9 @@
           <w:sz w:val="24"/>
           <w:u w:val="none"/>
         </w:rPr>
-        <w:t>S.BHAVYA SRI</w:t>
+        <w:t>S. BHAVYA SRI</w:t>
         <w:br/>
-        <w:t>Reg. No: 22MIA1010</w:t>
+        <w:t>REGISTER NO: 22MIA1010</w:t>
       </w:r>
     </w:p>
     <w:p>
@@ -526,7 +526,7 @@
           <w:sz w:val="24"/>
           <w:u w:val="none"/>
         </w:rPr>
-        <w:t>This is to certify that the project report entitled "ATGC-MACIDS: ADAPTIVE TRUST GRAPH CONSENSUS MULTI-AGENT INTRUSION DETECTION SYSTEM FOR HIGH-THROUGHPUT ENTERPRISE SUBNETS" submitted by S.BHAVYA SRI (Reg. No: 22MIA1010) in partial fulfillment of the requirements for the award of the degree of Master of Technology in Computer Science and Engineering with Specialization in Business Analytics, to School of Computer Science and Engineering (SCOPE), Vellore Institute of Technology (VIT), Chennai, is a record of bonafide work carried out by her under my supervision and guidance.</w:t>
+        <w:t>This is to certify that the project report entitled "ATGC-MACIDS: ADAPTIVE TRUST GRAPH CONSENSUS MULTI-AGENT INTRUSION DETECTION SYSTEM FOR HIGH-THROUGHPUT ENTERPRISE SUBNETS" submitted by S. BHAVYA SRI (Register No: 22MIA1010) in partial fulfillment of the requirements for the award of the degree of Master of Technology in Computer Science and Engineering with Specialization in Business Analytics, to School of Computer Science and Engineering (SCOPE), Vellore Institute of Technology (VIT), Chennai, is a record of bonafide work carried out by her under my supervision and guidance.</w:t>
       </w:r>
     </w:p>
     <w:p>
@@ -861,7 +861,7 @@
           <w:sz w:val="24"/>
           <w:u w:val="none"/>
         </w:rPr>
-        <w:t>S.BHAVYA SRI</w:t>
+        <w:t>S. BHAVYA SRI</w:t>
       </w:r>
     </w:p>
     <w:p>

</xml_diff>